<commit_message>
Sync built docs + deploy record; gitignore local dev scratch
Commit the regenerated www/ documentation (getting_started, methodology,
questionnaire .docx/.pdf) and the updated shinyapps deploy record so the repo
reflects the current deployed state. Add the local-only dev scratch (claude_old/
backup, ZAM/ Zambia test inventory, AI_model_prices/, and the ad-hoc analyze_/
inspect_/count_ scripts) to .gitignore, consistent with the existing rules for
real-country test data and one-off debug scripts.

Co-Authored-By: Claude Opus 4.8 (1M context) <noreply@anthropic.com>
</commit_message>
<xml_diff>
--- a/www/getting_started.docx
+++ b/www/getting_started.docx
@@ -3396,13 +3396,13 @@
 </file>
 
 <file path=customXml/itemProps1.xml><?xml version="1.0" encoding="utf-8"?>
-<ds:datastoreItem xmlns:ds="http://schemas.openxmlformats.org/officeDocument/2006/customXml" ds:itemID="{D833911F-467F-423F-B20E-0D89DEC9F527}"/>
+<ds:datastoreItem xmlns:ds="http://schemas.openxmlformats.org/officeDocument/2006/customXml" ds:itemID="{87A7A9A6-68EA-48AF-A1AA-2174A3313D90}"/>
 </file>
 
 <file path=customXml/itemProps2.xml><?xml version="1.0" encoding="utf-8"?>
-<ds:datastoreItem xmlns:ds="http://schemas.openxmlformats.org/officeDocument/2006/customXml" ds:itemID="{16EEEAA1-43CB-494D-8D31-484712411817}"/>
+<ds:datastoreItem xmlns:ds="http://schemas.openxmlformats.org/officeDocument/2006/customXml" ds:itemID="{B6CE3FFB-9ECC-4B3C-8998-F0C5EB85EF0D}"/>
 </file>
 
 <file path=customXml/itemProps3.xml><?xml version="1.0" encoding="utf-8"?>
-<ds:datastoreItem xmlns:ds="http://schemas.openxmlformats.org/officeDocument/2006/customXml" ds:itemID="{94B3430B-A2DA-4332-A861-08B308C0B30C}"/>
+<ds:datastoreItem xmlns:ds="http://schemas.openxmlformats.org/officeDocument/2006/customXml" ds:itemID="{A4C72B87-6F24-44A6-8F8D-E443E7457ED1}"/>
 </file>
</xml_diff>